<commit_message>
Slides e roteiro com linguagem mais simples e layout alinhado ao topo
Co-Authored-By: Claude Sonnet 5.5 <noreply@anthropic.com>
</commit_message>
<xml_diff>
--- a/docs/apresentacao/roteiro-de-fala.docx
+++ b/docs/apresentacao/roteiro-de-fala.docx
@@ -83,7 +83,7 @@
           <w:sz w:val="24"/>
           <w:szCs w:val="24"/>
         </w:rPr>
-        <w:t xml:space="preserve">Boa tarde. Eu sou o Pedro. Vou mostrar o Fortaleza Explora, um aplicativo que eu fiz para responder uma pergunta simples: o que eu faço agora em Fortaleza? Ele junta duas disciplinas: Desenvolvimento Web, porque é um aplicativo que roda no navegador e instala no celular, e Busca e Recuperação de Informação, porque o coração dele é um sistema de busca. Vou contar o problema, como eu pensei, o que eu usei e como eu garanti que os dados são confiáveis. No final tem os limites e o que ainda falta.</w:t>
+        <w:t xml:space="preserve">Boa tarde, eu sou o Pedro. Eu fiz o Fortaleza Explora, um aplicativo para responder uma pergunta simples: o que eu faço agora em Fortaleza? Ele junta duas matérias: Desenvolvimento Web, porque roda no navegador e dá para instalar no celular, e Busca e Recuperação de Informação, porque o coração dele é uma busca de lugares. Vou mostrar o problema, como eu pensei, o que eu usei e o que ainda falta.</w:t>
       </w:r>
     </w:p>
     <w:p>
@@ -114,7 +114,7 @@
           <w:sz w:val="24"/>
           <w:szCs w:val="24"/>
         </w:rPr>
-        <w:t xml:space="preserve">Quando eu penso em visitar uma cidade, as dúvidas são sempre as mesmas: está aberto? Vai chover? Vale a pena ir até lá? Os mapas comuns respondem “onde fica”, mas não respondem “o que eu faço agora”. Em Fortaleza isso pesa ainda mais, porque o plano muda muito com o horário e com o clima. Essa foi a pergunta que guiou o projeto.</w:t>
+        <w:t xml:space="preserve">Quando a gente vai a um lugar novo, as dúvidas são sempre as mesmas: está aberto? Vai chover? Vale a pena ir? Os mapas comuns dizem onde o lugar fica, mas não dizem o que fazer agora. Em Fortaleza isso pesa mais, porque o plano muda muito com o horário e com o clima. Foi essa a pergunta que guiou o projeto.</w:t>
       </w:r>
     </w:p>
     <w:p>
@@ -145,7 +145,7 @@
           <w:sz w:val="24"/>
           <w:szCs w:val="24"/>
         </w:rPr>
-        <w:t xml:space="preserve">A proposta que recebi foi montar um aplicativo de busca, tipo um Waze sobre o que há de interessante em Fortaleza. Eu transformei isso em quatro peças: uma busca que entende erro de digitação; mapa e rotas; contexto, ou seja, hora, sol, chuva e mar; e comunidade, com avisos que somem sozinhos, que é a ideia do Waze. Cada uma dessas peças aparece nos próximos slides.</w:t>
+        <w:t xml:space="preserve">A proposta era fazer um aplicativo de busca, tipo um Waze de lugares interessantes de Fortaleza. Eu dividi em quatro partes: uma busca que entende erro de digitação, mapa e rotas, o contexto, que é hora, sol, chuva e mar, e a comunidade, com avisos que somem sozinhos, como no Waze.</w:t>
       </w:r>
     </w:p>
     <w:p>
@@ -176,7 +176,7 @@
           <w:sz w:val="24"/>
           <w:szCs w:val="24"/>
         </w:rPr>
-        <w:t xml:space="preserve">Eu não inventei tudo do zero. Estudei como apps do mundo resolvem problemas parecidos e peguei a ideia, não o código. Do Waze veio a informação da comunidade que vence sozinha, com validade. Do Citymapper, comparar os modos de ir lado a lado. Do Swarm, o passaporte com selos. De apps de surfe e vento, mostrar o mar em linguagem simples. De apps de fotografia, a hora da luz boa. E dos guias de turismo, a curadoria: poucos lugares, bem escolhidos. Cada ideia virou uma função do meu app.</w:t>
+        <w:t xml:space="preserve">Eu não inventei tudo do zero. Olhei como outros apps resolvem problemas parecidos e peguei as ideias. Do Waze, a informação da comunidade com validade. Do Citymapper, comparar as formas de ir lado a lado. Do Swarm, o passaporte com selos. De apps de surfe, mostrar o mar de um jeito simples. De apps de foto, a hora da luz boa. E dos guias de turismo, poucos lugares bem escolhidos.</w:t>
       </w:r>
     </w:p>
     <w:p>
@@ -207,7 +207,7 @@
           <w:sz w:val="24"/>
           <w:szCs w:val="24"/>
         </w:rPr>
-        <w:t xml:space="preserve">Este é o resultado. À esquerda o mapa de Fortaleza, com um pin para cada lugar, na cor da categoria. À direita a lista, que eu desenhei como um guia de revista: foto real, categoria, título e as informações principais. E no topo, em laranja, a sugestão do momento. Na hora do almoço ele sugere lugares para comer; perto do pôr do sol, sugere mirantes; se estiver chovendo, só lugares cobertos. Nos próximos slides eu explico como cada parte funciona por dentro.</w:t>
+        <w:t xml:space="preserve">Este é o resultado. À esquerda, o mapa com um pin para cada lugar. À direita, a lista, que eu desenhei parecida com um guia de revista: foto, categoria, nome e as informações principais. No topo, em laranja, fica a sugestão do momento: na hora do almoço ele sugere lugares para comer, perto do pôr do sol sugere mirantes, e se estiver chovendo mostra só lugares cobertos.</w:t>
       </w:r>
     </w:p>
     <w:p>
@@ -238,7 +238,7 @@
           <w:sz w:val="24"/>
           <w:szCs w:val="24"/>
         </w:rPr>
-        <w:t xml:space="preserve">Em tecnologia eu fiz uma escolha de propósito: não usei framework. É HTML, CSS e JavaScript puros. Isso deixa o aplicativo leve, com 112 KB de código meu, e fácil de explicar. Eu separei em três camadas. A interface, que é o que se vê na tela, com o Leaflet para o mapa. A lógica, que são módulos que não mexem na tela, por isso eu consigo testar cada um sozinho com testes automáticos. E os dados: uma base de 32 lugares conferidos e cinco serviços abertos. Como tudo roda no navegador, eu não precisei de servidor próprio, e isso deixa a hospedagem gratuita.</w:t>
+        <w:t xml:space="preserve">Eu escolhi não usar framework, só HTML, CSS e JavaScript. Fica leve e mais fácil de eu explicar. O app tem três camadas: a interface, que é o que se vê, com o Leaflet para o mapa; a lógica, que são arquivos separados que eu consigo testar sozinhos; e os dados, com 32 lugares que eu conferi e cinco serviços abertos. Como tudo roda no navegador, não precisei de servidor, e a hospedagem é gratuita.</w:t>
       </w:r>
     </w:p>
     <w:p>
@@ -269,7 +269,7 @@
           <w:sz w:val="24"/>
           <w:szCs w:val="24"/>
         </w:rPr>
-        <w:t xml:space="preserve">Aqui estão as fontes de dados. O mapa e as ruas vêm do OpenStreetMap, que é como a Wikipédia dos mapas. As rotas vêm do OSRM. Para achar lugares que não estão na minha base eu consulto o Overpass e o Nominatim, que são buscas do próprio OpenStreetMap. O clima, o UV, o vento e o mar vêm do Open-Meteo. As fotos vêm do Wikimedia Commons, e eu só uso as que têm licença livre, mostrando autor e licença em cada uma. E tem a minha base curada, com 32 lugares. O ponto importante: nenhum desses serviços pede chave nem cadastro, então qualquer pessoa consegue reproduzir o projeto.</w:t>
+        <w:t xml:space="preserve">O mapa e as ruas vêm do OpenStreetMap, que é como a Wikipédia dos mapas. As rotas vêm do OSRM. Para achar lugares que não estão na minha base, uso o Overpass e o Nominatim, também do OpenStreetMap. Clima, UV, vento e mar vêm do Open-Meteo. As fotos vêm do Wikimedia Commons, só com licença livre, e o app mostra o autor de cada uma. E tem a minha base com 32 lugares. Nenhum desses serviços pede chave ou cadastro.</w:t>
       </w:r>
     </w:p>
     <w:p>
@@ -300,7 +300,7 @@
           <w:sz w:val="24"/>
           <w:szCs w:val="24"/>
         </w:rPr>
-        <w:t xml:space="preserve">Esta é a parte que mais tem a ver com a disciplina de Busca. Quando alguém digita, o app faz quatro coisas. Primeiro, tira acentos e maiúsculas, para praça e Praça serem a mesma coisa. Segundo, dá pontos por campo: se a palavra está no nome vale mais do que se está só na descrição. Terceiro, entende sinônimos: quem digita “comer” encontra restaurantes e peixe. Quarto, tolera erro de digitação, usando a distância de Levenshtein, que conta quantas letras mudaram: “mercdo” está a uma letra de “mercado”. À direita, o caso que eu mais gosto: “churrascaria” não está na minha base de 32 lugares. Em vez de dizer “nada encontrado”, o app procura em toda Fortaleza, em duas fontes ao mesmo tempo, e mostra os resultados à medida que chegam. Nesta busca vieram 46 lugares. O resultado também fica guardado por 24 horas, então repetir a busca é instantâneo e funciona até sem internet.</w:t>
+        <w:t xml:space="preserve">Esta é a parte mais ligada à matéria de Busca. Quando alguém digita, o app faz quatro coisas. Primeiro, ignora acento e maiúscula, então praça e Praça são a mesma coisa. Segundo, dá mais pontos se a palavra está no nome do que se está só na descrição. Terceiro, entende sinônimos: quem digita “comer” encontra restaurantes. Quarto, aceita erro de digitação, usando a distância de Levenshtein, que conta quantas letras são diferentes: “mercdo” está a uma letra de “mercado”. E tem o caso que eu mais gosto: “churrascaria” não está na minha base. Em vez de mostrar “nada encontrado”, o app procura em toda Fortaleza e achou 46 lugares. O resultado fica guardado por 24 horas, então repetir a busca é rápido.</w:t>
       </w:r>
     </w:p>
     <w:p>
@@ -331,7 +331,7 @@
           <w:sz w:val="24"/>
           <w:szCs w:val="24"/>
         </w:rPr>
-        <w:t xml:space="preserve">Este é o diferencial. O app olha o contexto. A hora e o pôr do sol eu calculo dentro do próprio aparelho, com um algoritmo público da NOAA, então funciona até sem internet. Se estiver chovendo, o app só sugere lugares cobertos. Nas praias, ele mostra as ondas, a temperatura da água, o UV e o vento, e dá um conselho em palavras simples, como “UV alto: passe protetor”. E um detalhe que parece pequeno mas importa: tudo usa o horário de Fortaleza. Um turista com o celular em outro fuso horário ainda vê “aberto” ou “fechado” corretamente. Os dados do mar vêm de um modelo meteorológico, não de um sensor na praia, então são uma estimativa.</w:t>
+        <w:t xml:space="preserve">Este é o diferencial. A hora e o pôr do sol são calculados dentro do próprio aparelho, então funciona até sem internet. Se estiver chovendo, só aparecem lugares cobertos. Nas praias o app mostra ondas, temperatura da água, UV e vento, com um conselho simples, como “UV alto: passe protetor”. Tudo usa o horário de Fortaleza, então até um turista com o celular em outro fuso vê “aberto” ou “fechado” certo. Os dados do mar são uma estimativa, não vêm de um sensor na praia.</w:t>
       </w:r>
     </w:p>
     <w:p>
@@ -362,7 +362,7 @@
           <w:sz w:val="24"/>
           <w:szCs w:val="24"/>
         </w:rPr>
-        <w:t xml:space="preserve">Aqui tem duas funções. À esquerda, a rota. Em vez de escolher um modo e esperar, o app pede as três rotas ao mesmo tempo, carro, bike e a pé, e mostra o tempo de cada uma lado a lado: 5 minutos de carro, 13 de bike, 30 a pé. E quando o lugar é de pôr do sol, ele calcula a que horas você precisa sair para chegar com folga. À direita, o roteiro. Se a pessoa escolhe vários lugares, a ordem em que ela visita faz diferença na distância. É o problema do caixeiro viajante, que é difícil de resolver de forma exata. Eu usei uma heurística: começo pelo vizinho mais próximo e depois melhoro o caminho com a técnica 2-opt, que desfaz cruzamentos. Não garante o melhor possível, mas para poucas paradas é rápido e bom, e nos testes ele nunca ficou pior que a ordem original.</w:t>
+        <w:t xml:space="preserve">Aqui são duas funções. À esquerda, a rota: o app mostra carro, bike e a pé ao mesmo tempo, com o tempo de cada um, por exemplo 5, 13 e 30 minutos. Para o pôr do sol, ele diz a que horas você precisa sair. À direita, o roteiro: quando a pessoa escolhe vários lugares, a ordem da visita muda muito a distância. Eu usei um método simples: começar pelo lugar mais próximo e, depois, desfazer os cruzamentos do caminho. Não garante o melhor caminho possível, mas para poucas paradas fica rápido e bom.</w:t>
       </w:r>
     </w:p>
     <w:p>
@@ -393,69 +393,69 @@
           <w:sz w:val="24"/>
           <w:szCs w:val="24"/>
         </w:rPr>
-        <w:t xml:space="preserve">Um app útil precisa de um motivo para a pessoa voltar e para contar aos amigos. Do Swarm eu peguei a ideia do passaporte: em cada lugar a pessoa toca em “Já fui aqui” e ganha um carimbo, com a data. O app mostra o progresso por categoria e dez selos, como “Praieiro” para quem visita três praias. Isso fica só no aparelho dela. Já o cartão para Stories é uma imagem que o próprio app desenha quando a pessoa monta um roteiro: título, mapa estilizado do caminho e a lista de paradas, com o nome do app embaixo. É divulgação gratuita, feita pelos próprios usuários.</w:t>
-      </w:r>
-    </w:p>
-    <w:p>
-      <w:pPr>
-        <w:pStyle w:val="Heading1"/>
-        <w:keepNext/>
-        <w:spacing w:after="120" w:before="320"/>
-      </w:pPr>
-      <w:r>
-        <w:rPr>
-          <w:rFonts w:ascii="Calibri" w:cs="Calibri" w:eastAsia="Calibri" w:hAnsi="Calibri"/>
-          <w:b/>
-          <w:bCs/>
-          <w:color w:val="0B6E72"/>
-          <w:sz w:val="30"/>
-          <w:szCs w:val="30"/>
-        </w:rPr>
-        <w:t xml:space="preserve">Slide 12 — Como tirei a “cara de IA” do app</w:t>
-      </w:r>
-    </w:p>
-    <w:p>
-      <w:pPr>
-        <w:spacing w:after="120" w:line="360"/>
-      </w:pPr>
-      <w:r>
-        <w:rPr>
-          <w:rFonts w:ascii="Calibri" w:cs="Calibri" w:eastAsia="Calibri" w:hAnsi="Calibri"/>
-          <w:sz w:val="24"/>
-          <w:szCs w:val="24"/>
-        </w:rPr>
-        <w:t xml:space="preserve">Eu me preocupei que o app não parecesse genérico, desses feitos por inteligência artificial. Pesquisei o que costuma denunciar esse visual: gradiente roxo, uma fonte só para tudo, cantos arredondados iguais em tudo, emojis no lugar de ícones, cartões iguais em fila. E tomei decisões contrárias. Escolhi uma paleta própria, tirada da cidade: papel quente, verde do mar e laranja do sol. Usei três fontes com função: Young Serif nos títulos, Atkinson Hyperlegible no texto, que foi desenhada para ser muito legível, e Caveat para as dicas, como se fossem escritas à caneta. Coloquei fotos reais com crédito. Desenhei uma jangada em estilo de xilogravura, que lembra a arte de cordel do Ceará. E a lista é um índice de guia, com linhas finas e cantos quase retos, em vez de cartões iguais.</w:t>
-      </w:r>
-    </w:p>
-    <w:p>
-      <w:pPr>
-        <w:pStyle w:val="Heading1"/>
-        <w:keepNext/>
-        <w:spacing w:after="120" w:before="320"/>
-      </w:pPr>
-      <w:r>
-        <w:rPr>
-          <w:rFonts w:ascii="Calibri" w:cs="Calibri" w:eastAsia="Calibri" w:hAnsi="Calibri"/>
-          <w:b/>
-          <w:bCs/>
-          <w:color w:val="0B6E72"/>
-          <w:sz w:val="30"/>
-          <w:szCs w:val="30"/>
-        </w:rPr>
-        <w:t xml:space="preserve">Slide 13 — Instala como aplicativo e funciona sem internet</w:t>
-      </w:r>
-    </w:p>
-    <w:p>
-      <w:pPr>
-        <w:spacing w:after="120" w:line="360"/>
-      </w:pPr>
-      <w:r>
-        <w:rPr>
-          <w:rFonts w:ascii="Calibri" w:cs="Calibri" w:eastAsia="Calibri" w:hAnsi="Calibri"/>
-          <w:sz w:val="24"/>
-          <w:szCs w:val="24"/>
-        </w:rPr>
-        <w:t xml:space="preserve">A maior parte das pessoas vai usar no celular, então eu pensei nele primeiro. O aplicativo é uma PWA, um aplicativo web progressivo: dá para instalar na tela inicial e abrir sem a barra do navegador. Um service worker guarda o aplicativo, a base e as fontes, então ele abre mesmo sem internet. A lista virou uma gaveta que acompanha o dedo: dá para empurrar para baixo e ver o mapa inteiro, e puxar para cima para ver a lista. Tem busca por voz, um guia que fala quando você chega perto de um lugar do roteiro, e o botão “perto de mim”. A localização e o microfone só são pedidos quando a pessoa toca nos botões, nunca ao abrir. Atenção: eu simulei o comportamento do celular no computador. O teste em aparelhos reais ainda precisa ser feito.</w:t>
+        <w:t xml:space="preserve">Um app precisa de um motivo para a pessoa voltar. Do Swarm eu peguei o passaporte: em cada lugar a pessoa toca em “Já fui aqui” e ganha um carimbo com a data. O app mostra o progresso por categoria e dez selos, como o “Praieiro” para quem visita três praias. Isso fica só no aparelho dela. Já o cartão para Stories é uma imagem que o app desenha com o roteiro montado: título, mapa do caminho e a lista de paradas. É divulgação feita pelos próprios usuários.</w:t>
+      </w:r>
+    </w:p>
+    <w:p>
+      <w:pPr>
+        <w:pStyle w:val="Heading1"/>
+        <w:keepNext/>
+        <w:spacing w:after="120" w:before="320"/>
+      </w:pPr>
+      <w:r>
+        <w:rPr>
+          <w:rFonts w:ascii="Calibri" w:cs="Calibri" w:eastAsia="Calibri" w:hAnsi="Calibri"/>
+          <w:b/>
+          <w:bCs/>
+          <w:color w:val="0B6E72"/>
+          <w:sz w:val="30"/>
+          <w:szCs w:val="30"/>
+        </w:rPr>
+        <w:t xml:space="preserve">Slide 12 — Como eu cuidei do visual</w:t>
+      </w:r>
+    </w:p>
+    <w:p>
+      <w:pPr>
+        <w:spacing w:after="120" w:line="360"/>
+      </w:pPr>
+      <w:r>
+        <w:rPr>
+          <w:rFonts w:ascii="Calibri" w:cs="Calibri" w:eastAsia="Calibri" w:hAnsi="Calibri"/>
+          <w:sz w:val="24"/>
+          <w:szCs w:val="24"/>
+        </w:rPr>
+        <w:t xml:space="preserve">Eu queria que o app tivesse cara própria e não parecesse um modelo pronto. Escolhi cores tiradas da cidade: papel quente, verde do mar e laranja do sol. Usei três fontes, cada uma com uma função: uma para os títulos, uma bem legível para o texto e uma de letra à mão para as dicas. Coloquei fotos reais com crédito e desenhei uma jangada em estilo de xilogravura, que lembra o cordel do Ceará. E a lista tem linhas finas, como um índice de guia, em vez de cartões todos iguais.</w:t>
+      </w:r>
+    </w:p>
+    <w:p>
+      <w:pPr>
+        <w:pStyle w:val="Heading1"/>
+        <w:keepNext/>
+        <w:spacing w:after="120" w:before="320"/>
+      </w:pPr>
+      <w:r>
+        <w:rPr>
+          <w:rFonts w:ascii="Calibri" w:cs="Calibri" w:eastAsia="Calibri" w:hAnsi="Calibri"/>
+          <w:b/>
+          <w:bCs/>
+          <w:color w:val="0B6E72"/>
+          <w:sz w:val="30"/>
+          <w:szCs w:val="30"/>
+        </w:rPr>
+        <w:t xml:space="preserve">Slide 13 — Instala como app e funciona sem internet</w:t>
+      </w:r>
+    </w:p>
+    <w:p>
+      <w:pPr>
+        <w:spacing w:after="120" w:line="360"/>
+      </w:pPr>
+      <w:r>
+        <w:rPr>
+          <w:rFonts w:ascii="Calibri" w:cs="Calibri" w:eastAsia="Calibri" w:hAnsi="Calibri"/>
+          <w:sz w:val="24"/>
+          <w:szCs w:val="24"/>
+        </w:rPr>
+        <w:t xml:space="preserve">Como a maioria vai usar no celular, eu pensei nele primeiro. É um PWA, ou seja, dá para instalar na tela inicial e abrir sem a barra do navegador. O app guarda os arquivos no aparelho, então abre até sem internet. A lista é uma gaveta que acompanha o dedo: empurra para ver o mapa, puxa para ver a lista. Tem busca por voz, um guia que fala quando você chega perto de um lugar do roteiro e o botão “perto de mim”. A localização e o microfone só são pedidos quando a pessoa toca nos botões.</w:t>
       </w:r>
     </w:p>
     <w:p>
@@ -486,7 +486,7 @@
           <w:sz w:val="24"/>
           <w:szCs w:val="24"/>
         </w:rPr>
-        <w:t xml:space="preserve">Em um aplicativo de turismo, um pin no lugar errado é o erro mais visível. Por isso eu conferi os dados. Cada posição foi comparada com duas fontes independentes, o OpenStreetMap e a Wikipédia. Minhas estimativas iniciais erravam em até 1,6 km, o Farol do Mucuripe por exemplo, e eu corrigi todas. As descrições seguem os artigos da Wikipédia. As 27 fotos têm licença livre, e o app mostra o autor e a licença em cada uma. Um caso que mostra o valor da conferência: a Wikipédia apontava um forte em Portugal no lugar da Fortaleza de Nossa Senhora da Assunção, e eu só percebi porque comparei as coordenadas. E o que eu não consegui confirmar, eu tirei do app. Por fim, são 27 testes automáticos que rodam a cada publicação; se algum falhar, a versão antiga continua no ar. Um detalhe: os horários de funcionamento continuam estimados, e o app avisa isso.</w:t>
+        <w:t xml:space="preserve">Num app de turismo, um pin no lugar errado é o erro mais visível. Por isso eu conferi cada posição com duas fontes, o OpenStreetMap e a Wikipédia. Meus números iniciais erravam até 1,6 km, como no Farol do Mucuripe, e eu corrigi todos. As 27 fotos têm licença livre e mostram o autor. Teve um caso curioso: a Wikipédia apontava um forte em Portugal no lugar da Fortaleza de Nossa Senhora da Assunção, e eu só percebi porque comparei as coordenadas. O que eu não consegui confirmar, tirei do app. Também tenho 27 testes automáticos que rodam a cada publicação. Os horários de funcionamento ainda são estimados, e o app avisa isso.</w:t>
       </w:r>
     </w:p>
     <w:p>
@@ -517,7 +517,7 @@
           <w:sz w:val="24"/>
           <w:szCs w:val="24"/>
         </w:rPr>
-        <w:t xml:space="preserve">Para colocar no ar eu usei uma hospedagem gratuita, o GitHub Pages. O processo é automático. Eu envio o código para o GitHub. Um robô do próprio GitHub, o Actions, roda os 27 testes. Se passar, ele gera uma página para cada lugar, com título e descrição, o que ajuda o Google a encontrar o app, e publica com https, que é necessário para o GPS e para instalar o aplicativo. Se um teste falhar, a versão antiga continua no ar. O endereço está na tela e o código é aberto, com licença MIT. Se alguém da turma quiser abrir no celular agora, é só digitar o endereço.</w:t>
+        <w:t xml:space="preserve">Para publicar eu uso o GitHub Pages, que é gratuito. Funciona assim: eu envio o código para o GitHub, ele roda os 27 testes e, se tudo passar, publica o site com https, que é necessário para o GPS e para instalar o app. Se algum teste falhar, a versão antiga continua no ar. O endereço está na tela e o código é aberto. Quem quiser pode abrir no celular agora.</w:t>
       </w:r>
     </w:p>
     <w:p>
@@ -548,7 +548,7 @@
           <w:sz w:val="24"/>
           <w:szCs w:val="24"/>
         </w:rPr>
-        <w:t xml:space="preserve">Vou ser franco sobre os limites. Os horários de funcionamento são estimados, e o app avisa para confirmar no local. Os avisos da comunidade ficam só no aparelho de quem os criou, porque eu não tenho servidor; para valer entre pessoas, é preciso um servidor, e esse é o primeiro próximo passo. Os serviços gratuitos que eu uso às vezes demoram, por isso o app guarda o resultado da busca por 24 horas. Cinco lugares ficaram sem foto, porque não achei imagem livre adequada. E eu ainda preciso testar em mais celulares. Nos próximos passos: o servidor, preço real e acessibilidade com dados conferidos, inglês e espanhol, medir a qualidade da busca com métricas como precisão, e parcerias com o comércio local quando houver público.</w:t>
+        <w:t xml:space="preserve">Quero ser sincero sobre os limites. Os horários são estimados, e o app avisa para confirmar no local. Os avisos da comunidade ficam só no aparelho de quem criou, porque eu não tenho servidor; esse é o primeiro próximo passo. Os serviços gratuitos às vezes demoram. Cinco lugares ficaram sem foto, porque não achei imagem livre adequada. E eu ainda quero testar em mais celulares. Nos próximos passos, quero ter o servidor, versões em inglês e espanhol e medir a qualidade da busca.</w:t>
       </w:r>
     </w:p>
     <w:p>
@@ -579,31 +579,7 @@
           <w:sz w:val="24"/>
           <w:szCs w:val="24"/>
         </w:rPr>
-        <w:t xml:space="preserve">Quero deixar claro como eu trabalhei. Eu propus o problema e as ideias e decidi o que entra e o que fica de fora. O código foi escrito com ajuda de um assistente de inteligência artificial, o Claude Code. E o que torna isso confiável é a conferência: cada posição, foto e texto foi comparado com fontes abertas antes de entrar no aplicativo, e há testes automáticos. Tudo é código aberto e os créditos estão dentro do app.</w:t>
-      </w:r>
-    </w:p>
-    <w:p>
-      <w:pPr>
-        <w:shd w:fill="FCE4D6" w:val="clear"/>
-        <w:spacing w:after="120"/>
-      </w:pPr>
-      <w:r>
-        <w:rPr>
-          <w:rFonts w:ascii="Calibri" w:cs="Calibri" w:eastAsia="Calibri" w:hAnsi="Calibri"/>
-          <w:b/>
-          <w:bCs/>
-          <w:sz w:val="24"/>
-          <w:szCs w:val="24"/>
-        </w:rPr>
-        <w:t xml:space="preserve">Atenção: </w:t>
-      </w:r>
-      <w:r>
-        <w:rPr>
-          <w:rFonts w:ascii="Calibri" w:cs="Calibri" w:eastAsia="Calibri" w:hAnsi="Calibri"/>
-          <w:sz w:val="24"/>
-          <w:szCs w:val="24"/>
-        </w:rPr>
-        <w:t xml:space="preserve">ajuste este slide e a fala à regra da sua disciplina sobre o uso de ferramentas de apoio, e diga com suas palavras o que você decidiu, o que testou e o que aprendeu. Esteja pronto para explicar qualquer trecho do código se pedirem.</w:t>
+        <w:t xml:space="preserve">Para fechar, como foi o meu processo. Eu escolhi o tema, decidi o que entra no app e o que fica de fora, e defini cada função. Depois conferi os dados um por um, comparando com fontes abertas, e criei testes para não quebrar o que já funcionava. O que eu mais aprendi foi como funciona uma busca por dentro e como um app consegue funcionar sem servidor. Tudo é código aberto e os créditos estão dentro do app.</w:t>
       </w:r>
     </w:p>
     <w:p>
@@ -634,7 +610,7 @@
           <w:sz w:val="24"/>
           <w:szCs w:val="24"/>
         </w:rPr>
-        <w:t xml:space="preserve">Obrigado por ouvirem. O endereço do aplicativo está na tela, quem quiser pode abrir no celular e testar agora. Estou à disposição para perguntas, sobre a busca, sobre os dados, sobre o visual ou sobre qualquer parte do código.</w:t>
+        <w:t xml:space="preserve">Obrigado por ouvirem. O endereço do app está na tela, e quem quiser pode abrir no celular e testar agora. Fico à disposição para perguntas sobre a busca, os dados, o visual ou qualquer parte do código.</w:t>
       </w:r>
     </w:p>
     <w:sectPr>

</xml_diff>

<commit_message>
Slide 17 mais concreto e natural
Co-Authored-By: Claude Sonnet 5.5 <noreply@anthropic.com>
</commit_message>
<xml_diff>
--- a/docs/apresentacao/roteiro-de-fala.docx
+++ b/docs/apresentacao/roteiro-de-fala.docx
@@ -411,7 +411,7 @@
           <w:sz w:val="30"/>
           <w:szCs w:val="30"/>
         </w:rPr>
-        <w:t xml:space="preserve">Slide 12 — Como eu cuidei do visual</w:t>
+        <w:t xml:space="preserve">Slide 12 — O visual do app</w:t>
       </w:r>
     </w:p>
     <w:p>
@@ -566,20 +566,20 @@
           <w:sz w:val="30"/>
           <w:szCs w:val="30"/>
         </w:rPr>
-        <w:t xml:space="preserve">Slide 17 — Como eu trabalhei</w:t>
-      </w:r>
-    </w:p>
-    <w:p>
-      <w:pPr>
-        <w:spacing w:after="120" w:line="360"/>
-      </w:pPr>
-      <w:r>
-        <w:rPr>
-          <w:rFonts w:ascii="Calibri" w:cs="Calibri" w:eastAsia="Calibri" w:hAnsi="Calibri"/>
-          <w:sz w:val="24"/>
-          <w:szCs w:val="24"/>
-        </w:rPr>
-        <w:t xml:space="preserve">Para fechar, como foi o meu processo. Eu escolhi o tema, decidi o que entra no app e o que fica de fora, e defini cada função. Depois conferi os dados um por um, comparando com fontes abertas, e criei testes para não quebrar o que já funcionava. O que eu mais aprendi foi como funciona uma busca por dentro e como um app consegue funcionar sem servidor. Tudo é código aberto e os créditos estão dentro do app.</w:t>
+        <w:t xml:space="preserve">Slide 17 — Como foi feito</w:t>
+      </w:r>
+    </w:p>
+    <w:p>
+      <w:pPr>
+        <w:spacing w:after="120" w:line="360"/>
+      </w:pPr>
+      <w:r>
+        <w:rPr>
+          <w:rFonts w:ascii="Calibri" w:cs="Calibri" w:eastAsia="Calibri" w:hAnsi="Calibri"/>
+          <w:sz w:val="24"/>
+          <w:szCs w:val="24"/>
+        </w:rPr>
+        <w:t xml:space="preserve">Resumindo como o projeto foi montado. O mapa usa o Leaflet com os dados do OpenStreetMap, e as rotas vêm da API do OSRM. A busca é um código próprio, com pontuação por campo, sinônimos e tolerância a erro de digitação. Chuva, UV, vento e ondas vêm da API do Open-Meteo. Os 32 lugares foram conferidos com o OpenStreetMap e a Wikipédia, e as fotos são do Wikimedia Commons, só com licença livre. Para publicar, o GitHub roda os testes e coloca o site no ar. Aprendi bastante sobre como uma busca funciona por dentro e como um app roda sem servidor.</w:t>
       </w:r>
     </w:p>
     <w:p>

</xml_diff>

<commit_message>
Apresentacao em 13 slides para o professor (visao geral) + apendice tecnico para os colegas
Co-Authored-By: Claude Sonnet 5.5 <noreply@anthropic.com>
</commit_message>
<xml_diff>
--- a/docs/apresentacao/roteiro-de-fala.docx
+++ b/docs/apresentacao/roteiro-de-fala.docx
@@ -44,15 +44,15 @@
           <w:sz w:val="24"/>
           <w:szCs w:val="24"/>
         </w:rPr>
-        <w:t xml:space="preserve">Antes de apresentar: </w:t>
-      </w:r>
-      <w:r>
-        <w:rPr>
-          <w:rFonts w:ascii="Calibri" w:cs="Calibri" w:eastAsia="Calibri" w:hAnsi="Calibri"/>
-          <w:sz w:val="24"/>
-          <w:szCs w:val="24"/>
-        </w:rPr>
-        <w:t xml:space="preserve">18 slides, cerca de 15 minutos (≈ 50 segundos por slide). Treine em voz alta e troque o que não soar como você. Esteja pronto para explicar qualquer trecho do código. Atalhos da apresentação: setas navegam, N mostra as notas, F tela cheia.</w:t>
+        <w:t xml:space="preserve">Como usar: </w:t>
+      </w:r>
+      <w:r>
+        <w:rPr>
+          <w:rFonts w:ascii="Calibri" w:cs="Calibri" w:eastAsia="Calibri" w:hAnsi="Calibri"/>
+          <w:sz w:val="24"/>
+          <w:szCs w:val="24"/>
+        </w:rPr>
+        <w:t xml:space="preserve">slides 1 a 13 = apresentação principal (≈ 15 minutos, ≈ 70 s por slide, programação só em visão geral). Slides 14 a 19 = apêndice técnico para perguntas dos colegas. Treine em voz alta e troque o que não soar como você. Atalhos do site: setas navegam, N mostra as notas, F tela cheia.</w:t>
       </w:r>
     </w:p>
     <w:p>
@@ -83,25 +83,25 @@
           <w:sz w:val="24"/>
           <w:szCs w:val="24"/>
         </w:rPr>
-        <w:t xml:space="preserve">Boa tarde, eu sou o Pedro. Eu fiz o Fortaleza Explora, um aplicativo para responder uma pergunta simples: o que eu faço agora em Fortaleza? Ele junta duas matérias: Desenvolvimento Web, porque roda no navegador e dá para instalar no celular, e Busca e Recuperação de Informação, porque o coração dele é uma busca de lugares. Vou mostrar o problema, como eu pensei, o que eu usei e o que ainda falta.</w:t>
-      </w:r>
-    </w:p>
-    <w:p>
-      <w:pPr>
-        <w:pStyle w:val="Heading1"/>
-        <w:keepNext/>
-        <w:spacing w:after="120" w:before="320"/>
-      </w:pPr>
-      <w:r>
-        <w:rPr>
-          <w:rFonts w:ascii="Calibri" w:cs="Calibri" w:eastAsia="Calibri" w:hAnsi="Calibri"/>
-          <w:b/>
-          <w:bCs/>
-          <w:color w:val="0B6E72"/>
-          <w:sz w:val="30"/>
-          <w:szCs w:val="30"/>
-        </w:rPr>
-        <w:t xml:space="preserve">Slide 2 — Quem está em Fortaleza não sabe o que fazer agora</w:t>
+        <w:t xml:space="preserve">Boa tarde, eu sou o Pedro. Eu fiz o Fortaleza Explora, um aplicativo para responder uma pergunta simples: o que eu faço agora em Fortaleza? Ele junta duas matérias: Desenvolvimento Web, porque roda no navegador e dá para instalar no celular, e Busca e Recuperação de Informação, porque o centro dele é uma busca de lugares. Vou mostrar o problema, a ideia, o que o app faz, o que eu usei e o que ainda dá para melhorar.</w:t>
+      </w:r>
+    </w:p>
+    <w:p>
+      <w:pPr>
+        <w:pStyle w:val="Heading1"/>
+        <w:keepNext/>
+        <w:spacing w:after="120" w:before="320"/>
+      </w:pPr>
+      <w:r>
+        <w:rPr>
+          <w:rFonts w:ascii="Calibri" w:cs="Calibri" w:eastAsia="Calibri" w:hAnsi="Calibri"/>
+          <w:b/>
+          <w:bCs/>
+          <w:color w:val="0B6E72"/>
+          <w:sz w:val="30"/>
+          <w:szCs w:val="30"/>
+        </w:rPr>
+        <w:t xml:space="preserve">Slide 2 — O problema</w:t>
       </w:r>
     </w:p>
     <w:p>
@@ -132,485 +132,533 @@
           <w:sz w:val="30"/>
           <w:szCs w:val="30"/>
         </w:rPr>
-        <w:t xml:space="preserve">Slide 3 — Um Waze, mas de lugares</w:t>
-      </w:r>
-    </w:p>
-    <w:p>
-      <w:pPr>
-        <w:spacing w:after="120" w:line="360"/>
-      </w:pPr>
-      <w:r>
-        <w:rPr>
-          <w:rFonts w:ascii="Calibri" w:cs="Calibri" w:eastAsia="Calibri" w:hAnsi="Calibri"/>
-          <w:sz w:val="24"/>
-          <w:szCs w:val="24"/>
-        </w:rPr>
-        <w:t xml:space="preserve">A proposta era fazer um aplicativo de busca, tipo um Waze de lugares interessantes de Fortaleza. Eu dividi em quatro partes: uma busca que entende erro de digitação, mapa e rotas, o contexto, que é hora, sol, chuva e mar, e a comunidade, com avisos que somem sozinhos, como no Waze.</w:t>
-      </w:r>
-    </w:p>
-    <w:p>
-      <w:pPr>
-        <w:pStyle w:val="Heading1"/>
-        <w:keepNext/>
-        <w:spacing w:after="120" w:before="320"/>
-      </w:pPr>
-      <w:r>
-        <w:rPr>
-          <w:rFonts w:ascii="Calibri" w:cs="Calibri" w:eastAsia="Calibri" w:hAnsi="Calibri"/>
-          <w:b/>
-          <w:bCs/>
-          <w:color w:val="0B6E72"/>
-          <w:sz w:val="30"/>
-          <w:szCs w:val="30"/>
-        </w:rPr>
-        <w:t xml:space="preserve">Slide 4 — Aprendi com apps do mundo todo</w:t>
-      </w:r>
-    </w:p>
-    <w:p>
-      <w:pPr>
-        <w:spacing w:after="120" w:line="360"/>
-      </w:pPr>
-      <w:r>
-        <w:rPr>
-          <w:rFonts w:ascii="Calibri" w:cs="Calibri" w:eastAsia="Calibri" w:hAnsi="Calibri"/>
-          <w:sz w:val="24"/>
-          <w:szCs w:val="24"/>
-        </w:rPr>
-        <w:t xml:space="preserve">Eu não inventei tudo do zero. Olhei como outros apps resolvem problemas parecidos e peguei as ideias. Do Waze, a informação da comunidade com validade. Do Citymapper, comparar as formas de ir lado a lado. Do Swarm, o passaporte com selos. De apps de surfe, mostrar o mar de um jeito simples. De apps de foto, a hora da luz boa. E dos guias de turismo, poucos lugares bem escolhidos.</w:t>
-      </w:r>
-    </w:p>
-    <w:p>
-      <w:pPr>
-        <w:pStyle w:val="Heading1"/>
-        <w:keepNext/>
-        <w:spacing w:after="120" w:before="320"/>
-      </w:pPr>
-      <w:r>
-        <w:rPr>
-          <w:rFonts w:ascii="Calibri" w:cs="Calibri" w:eastAsia="Calibri" w:hAnsi="Calibri"/>
-          <w:b/>
-          <w:bCs/>
-          <w:color w:val="0B6E72"/>
-          <w:sz w:val="30"/>
-          <w:szCs w:val="30"/>
-        </w:rPr>
-        <w:t xml:space="preserve">Slide 5 — O Fortaleza Explora</w:t>
-      </w:r>
-    </w:p>
-    <w:p>
-      <w:pPr>
-        <w:spacing w:after="120" w:line="360"/>
-      </w:pPr>
-      <w:r>
-        <w:rPr>
-          <w:rFonts w:ascii="Calibri" w:cs="Calibri" w:eastAsia="Calibri" w:hAnsi="Calibri"/>
-          <w:sz w:val="24"/>
-          <w:szCs w:val="24"/>
-        </w:rPr>
-        <w:t xml:space="preserve">Este é o resultado. À esquerda, o mapa com um pin para cada lugar. À direita, a lista, que eu desenhei parecida com um guia de revista: foto, categoria, nome e as informações principais. No topo, em laranja, fica a sugestão do momento: na hora do almoço ele sugere lugares para comer, perto do pôr do sol sugere mirantes, e se estiver chovendo mostra só lugares cobertos.</w:t>
-      </w:r>
-    </w:p>
-    <w:p>
-      <w:pPr>
-        <w:pStyle w:val="Heading1"/>
-        <w:keepNext/>
-        <w:spacing w:after="120" w:before="320"/>
-      </w:pPr>
-      <w:r>
-        <w:rPr>
-          <w:rFonts w:ascii="Calibri" w:cs="Calibri" w:eastAsia="Calibri" w:hAnsi="Calibri"/>
-          <w:b/>
-          <w:bCs/>
-          <w:color w:val="0B6E72"/>
-          <w:sz w:val="30"/>
-          <w:szCs w:val="30"/>
-        </w:rPr>
-        <w:t xml:space="preserve">Slide 6 — Três camadas, sem framework</w:t>
-      </w:r>
-    </w:p>
-    <w:p>
-      <w:pPr>
-        <w:spacing w:after="120" w:line="360"/>
-      </w:pPr>
-      <w:r>
-        <w:rPr>
-          <w:rFonts w:ascii="Calibri" w:cs="Calibri" w:eastAsia="Calibri" w:hAnsi="Calibri"/>
-          <w:sz w:val="24"/>
-          <w:szCs w:val="24"/>
-        </w:rPr>
-        <w:t xml:space="preserve">Eu escolhi não usar framework, só HTML, CSS e JavaScript. Fica leve e mais fácil de eu explicar. O app tem três camadas: a interface, que é o que se vê, com o Leaflet para o mapa; a lógica, que são arquivos separados que eu consigo testar sozinhos; e os dados, com 65 lugares que eu conferi e cinco serviços abertos. Como tudo roda no navegador, não precisei de servidor, e a hospedagem é gratuita.</w:t>
-      </w:r>
-    </w:p>
-    <w:p>
-      <w:pPr>
-        <w:pStyle w:val="Heading1"/>
-        <w:keepNext/>
-        <w:spacing w:after="120" w:before="320"/>
-      </w:pPr>
-      <w:r>
-        <w:rPr>
-          <w:rFonts w:ascii="Calibri" w:cs="Calibri" w:eastAsia="Calibri" w:hAnsi="Calibri"/>
-          <w:b/>
-          <w:bCs/>
-          <w:color w:val="0B6E72"/>
-          <w:sz w:val="30"/>
-          <w:szCs w:val="30"/>
-        </w:rPr>
-        <w:t xml:space="preserve">Slide 7 — De onde vem cada informação</w:t>
-      </w:r>
-    </w:p>
-    <w:p>
-      <w:pPr>
-        <w:spacing w:after="120" w:line="360"/>
-      </w:pPr>
-      <w:r>
-        <w:rPr>
-          <w:rFonts w:ascii="Calibri" w:cs="Calibri" w:eastAsia="Calibri" w:hAnsi="Calibri"/>
-          <w:sz w:val="24"/>
-          <w:szCs w:val="24"/>
-        </w:rPr>
-        <w:t xml:space="preserve">O mapa e as ruas vêm do OpenStreetMap, que é como a Wikipédia dos mapas. As rotas vêm do OSRM. Para achar lugares que não estão na minha base, uso o Overpass e o Nominatim, também do OpenStreetMap. Clima, UV, vento e mar vêm do Open-Meteo. As fotos vêm do Wikimedia Commons, só com licença livre, e o app mostra o autor de cada uma. E tem a minha base com 65 lugares. Nenhum desses serviços pede chave ou cadastro.</w:t>
-      </w:r>
-    </w:p>
-    <w:p>
-      <w:pPr>
-        <w:pStyle w:val="Heading1"/>
-        <w:keepNext/>
-        <w:spacing w:after="120" w:before="320"/>
-      </w:pPr>
-      <w:r>
-        <w:rPr>
-          <w:rFonts w:ascii="Calibri" w:cs="Calibri" w:eastAsia="Calibri" w:hAnsi="Calibri"/>
-          <w:b/>
-          <w:bCs/>
-          <w:color w:val="0B6E72"/>
-          <w:sz w:val="30"/>
-          <w:szCs w:val="30"/>
-        </w:rPr>
-        <w:t xml:space="preserve">Slide 8 — Busca que tolera erros e vai além da base</w:t>
-      </w:r>
-    </w:p>
-    <w:p>
-      <w:pPr>
-        <w:spacing w:after="120" w:line="360"/>
-      </w:pPr>
-      <w:r>
-        <w:rPr>
-          <w:rFonts w:ascii="Calibri" w:cs="Calibri" w:eastAsia="Calibri" w:hAnsi="Calibri"/>
-          <w:sz w:val="24"/>
-          <w:szCs w:val="24"/>
-        </w:rPr>
-        <w:t xml:space="preserve">Esta é a parte mais ligada à matéria de Busca. Quando alguém digita, o app faz quatro coisas. Primeiro, ignora acento e maiúscula, então praça e Praça são a mesma coisa. Segundo, dá mais pontos se a palavra está no nome do que se está só na descrição. Terceiro, entende sinônimos: quem digita “comer” encontra restaurantes. Quarto, aceita erro de digitação, usando a distância de Levenshtein, que conta quantas letras são diferentes: “mercdo” está a uma letra de “mercado”. E tem o caso que eu mais gosto: “churrascaria” não está na minha base. Em vez de mostrar “nada encontrado”, o app procura em toda Fortaleza e achou 46 lugares. O resultado fica guardado por 24 horas, então repetir a busca é rápido.</w:t>
-      </w:r>
-    </w:p>
-    <w:p>
-      <w:pPr>
-        <w:pStyle w:val="Heading1"/>
-        <w:keepNext/>
-        <w:spacing w:after="120" w:before="320"/>
-      </w:pPr>
-      <w:r>
-        <w:rPr>
-          <w:rFonts w:ascii="Calibri" w:cs="Calibri" w:eastAsia="Calibri" w:hAnsi="Calibri"/>
-          <w:b/>
-          <w:bCs/>
-          <w:color w:val="0B6E72"/>
-          <w:sz w:val="30"/>
-          <w:szCs w:val="30"/>
-        </w:rPr>
-        <w:t xml:space="preserve">Slide 9 — O app muda com a hora, o sol e a chuva</w:t>
-      </w:r>
-    </w:p>
-    <w:p>
-      <w:pPr>
-        <w:spacing w:after="120" w:line="360"/>
-      </w:pPr>
-      <w:r>
-        <w:rPr>
-          <w:rFonts w:ascii="Calibri" w:cs="Calibri" w:eastAsia="Calibri" w:hAnsi="Calibri"/>
-          <w:sz w:val="24"/>
-          <w:szCs w:val="24"/>
-        </w:rPr>
-        <w:t xml:space="preserve">Este é o diferencial. A hora e o pôr do sol são calculados dentro do próprio aparelho, então funciona até sem internet. Se estiver chovendo, só aparecem lugares cobertos. Nas praias o app mostra ondas, temperatura da água, UV e vento, com um conselho simples, como “UV alto: passe protetor”. Tudo usa o horário de Fortaleza, então até um turista com o celular em outro fuso vê “aberto” ou “fechado” certo. Os dados do mar são uma estimativa, não vêm de um sensor na praia.</w:t>
-      </w:r>
-    </w:p>
-    <w:p>
-      <w:pPr>
-        <w:pStyle w:val="Heading1"/>
-        <w:keepNext/>
-        <w:spacing w:after="120" w:before="320"/>
-      </w:pPr>
-      <w:r>
-        <w:rPr>
-          <w:rFonts w:ascii="Calibri" w:cs="Calibri" w:eastAsia="Calibri" w:hAnsi="Calibri"/>
-          <w:b/>
-          <w:bCs/>
-          <w:color w:val="0B6E72"/>
-          <w:sz w:val="30"/>
-          <w:szCs w:val="30"/>
-        </w:rPr>
-        <w:t xml:space="preserve">Slide 10 — Como chegar e em que ordem visitar</w:t>
-      </w:r>
-    </w:p>
-    <w:p>
-      <w:pPr>
-        <w:spacing w:after="120" w:line="360"/>
-      </w:pPr>
-      <w:r>
-        <w:rPr>
-          <w:rFonts w:ascii="Calibri" w:cs="Calibri" w:eastAsia="Calibri" w:hAnsi="Calibri"/>
-          <w:sz w:val="24"/>
-          <w:szCs w:val="24"/>
-        </w:rPr>
-        <w:t xml:space="preserve">Aqui são duas funções. À esquerda, a rota: o app mostra carro, bike e a pé ao mesmo tempo, com o tempo de cada um, por exemplo 5, 13 e 30 minutos. Para o pôr do sol, ele diz a que horas você precisa sair. À direita, o roteiro: quando a pessoa escolhe vários lugares, a ordem da visita muda muito a distância. Eu usei um método simples: começar pelo lugar mais próximo e, depois, desfazer os cruzamentos do caminho. Não garante o melhor caminho possível, mas para poucas paradas fica rápido e bom.</w:t>
-      </w:r>
-    </w:p>
-    <w:p>
-      <w:pPr>
-        <w:pStyle w:val="Heading1"/>
-        <w:keepNext/>
-        <w:spacing w:after="120" w:before="320"/>
-      </w:pPr>
-      <w:r>
-        <w:rPr>
-          <w:rFonts w:ascii="Calibri" w:cs="Calibri" w:eastAsia="Calibri" w:hAnsi="Calibri"/>
-          <w:b/>
-          <w:bCs/>
-          <w:color w:val="0B6E72"/>
-          <w:sz w:val="30"/>
-          <w:szCs w:val="30"/>
-        </w:rPr>
-        <w:t xml:space="preserve">Slide 11 — Passaporte e cartão para Stories</w:t>
-      </w:r>
-    </w:p>
-    <w:p>
-      <w:pPr>
-        <w:spacing w:after="120" w:line="360"/>
-      </w:pPr>
-      <w:r>
-        <w:rPr>
-          <w:rFonts w:ascii="Calibri" w:cs="Calibri" w:eastAsia="Calibri" w:hAnsi="Calibri"/>
-          <w:sz w:val="24"/>
-          <w:szCs w:val="24"/>
-        </w:rPr>
-        <w:t xml:space="preserve">Um app precisa de um motivo para a pessoa voltar. Do Swarm eu peguei o passaporte: em cada lugar a pessoa toca em “Já fui aqui” e ganha um carimbo com a data. O app mostra o progresso por categoria e dez selos, como o “Praieiro” para quem visita três praias. Isso fica só no aparelho dela. Já o cartão para Stories é uma imagem que o app desenha com o roteiro montado: título, mapa do caminho e a lista de paradas. É divulgação feita pelos próprios usuários.</w:t>
-      </w:r>
-    </w:p>
-    <w:p>
-      <w:pPr>
-        <w:pStyle w:val="Heading1"/>
-        <w:keepNext/>
-        <w:spacing w:after="120" w:before="320"/>
-      </w:pPr>
-      <w:r>
-        <w:rPr>
-          <w:rFonts w:ascii="Calibri" w:cs="Calibri" w:eastAsia="Calibri" w:hAnsi="Calibri"/>
-          <w:b/>
-          <w:bCs/>
-          <w:color w:val="0B6E72"/>
-          <w:sz w:val="30"/>
-          <w:szCs w:val="30"/>
-        </w:rPr>
-        <w:t xml:space="preserve">Slide 12 — O visual do app</w:t>
-      </w:r>
-    </w:p>
-    <w:p>
-      <w:pPr>
-        <w:spacing w:after="120" w:line="360"/>
-      </w:pPr>
-      <w:r>
-        <w:rPr>
-          <w:rFonts w:ascii="Calibri" w:cs="Calibri" w:eastAsia="Calibri" w:hAnsi="Calibri"/>
-          <w:sz w:val="24"/>
-          <w:szCs w:val="24"/>
-        </w:rPr>
-        <w:t xml:space="preserve">Eu queria que o app tivesse cara própria e não parecesse um modelo pronto. Escolhi cores tiradas da cidade: papel quente, verde do mar e laranja do sol. Usei três fontes, cada uma com uma função: uma para os títulos, uma bem legível para o texto e uma de letra à mão para as dicas. Coloquei fotos reais com crédito e desenhei uma jangada em estilo de xilogravura, que lembra o cordel do Ceará. E a lista tem linhas finas, como um índice de guia, em vez de cartões todos iguais.</w:t>
-      </w:r>
-    </w:p>
-    <w:p>
-      <w:pPr>
-        <w:pStyle w:val="Heading1"/>
-        <w:keepNext/>
-        <w:spacing w:after="120" w:before="320"/>
-      </w:pPr>
-      <w:r>
-        <w:rPr>
-          <w:rFonts w:ascii="Calibri" w:cs="Calibri" w:eastAsia="Calibri" w:hAnsi="Calibri"/>
-          <w:b/>
-          <w:bCs/>
-          <w:color w:val="0B6E72"/>
-          <w:sz w:val="30"/>
-          <w:szCs w:val="30"/>
-        </w:rPr>
-        <w:t xml:space="preserve">Slide 13 — Instala como app e funciona sem internet</w:t>
-      </w:r>
-    </w:p>
-    <w:p>
-      <w:pPr>
-        <w:spacing w:after="120" w:line="360"/>
-      </w:pPr>
-      <w:r>
-        <w:rPr>
-          <w:rFonts w:ascii="Calibri" w:cs="Calibri" w:eastAsia="Calibri" w:hAnsi="Calibri"/>
-          <w:sz w:val="24"/>
-          <w:szCs w:val="24"/>
-        </w:rPr>
-        <w:t xml:space="preserve">Como a maioria vai usar no celular, eu pensei nele primeiro. É um PWA, ou seja, dá para instalar na tela inicial e abrir sem a barra do navegador. O app guarda os arquivos no aparelho, então abre até sem internet. A lista é uma gaveta que acompanha o dedo: empurra para ver o mapa, puxa para ver a lista. Tem busca por voz, um guia que fala quando você chega perto de um lugar do roteiro e o botão “perto de mim”. A localização e o microfone só são pedidos quando a pessoa toca nos botões.</w:t>
-      </w:r>
-    </w:p>
-    <w:p>
-      <w:pPr>
-        <w:pStyle w:val="Heading1"/>
-        <w:keepNext/>
-        <w:spacing w:after="120" w:before="320"/>
-      </w:pPr>
-      <w:r>
-        <w:rPr>
-          <w:rFonts w:ascii="Calibri" w:cs="Calibri" w:eastAsia="Calibri" w:hAnsi="Calibri"/>
-          <w:b/>
-          <w:bCs/>
-          <w:color w:val="0B6E72"/>
-          <w:sz w:val="30"/>
-          <w:szCs w:val="30"/>
-        </w:rPr>
-        <w:t xml:space="preserve">Slide 14 — Como garanti que os dados são confiáveis</w:t>
-      </w:r>
-    </w:p>
-    <w:p>
-      <w:pPr>
-        <w:spacing w:after="120" w:line="360"/>
-      </w:pPr>
-      <w:r>
-        <w:rPr>
-          <w:rFonts w:ascii="Calibri" w:cs="Calibri" w:eastAsia="Calibri" w:hAnsi="Calibri"/>
-          <w:sz w:val="24"/>
-          <w:szCs w:val="24"/>
-        </w:rPr>
-        <w:t xml:space="preserve">Num app de turismo, um pin no lugar errado é o erro mais visível. Por isso eu conferi cada posição no OpenStreetMap e, quando tinha, também na Wikipédia. Meus números iniciais erravam até 1,6 km, como no Farol do Mucuripe, e eu corrigi todos. As 47 fotos têm licença livre e mostram o autor. Teve um caso curioso: a Wikipédia apontava um forte em Portugal no lugar da Fortaleza de Nossa Senhora da Assunção, e eu só percebi porque comparei as coordenadas. O que eu não consegui confirmar, tirei do app. Também tenho 28 testes automáticos que rodam a cada publicação. Os horários de funcionamento ainda são estimados, e o app avisa isso.</w:t>
-      </w:r>
-    </w:p>
-    <w:p>
-      <w:pPr>
-        <w:pStyle w:val="Heading1"/>
-        <w:keepNext/>
-        <w:spacing w:after="120" w:before="320"/>
-      </w:pPr>
-      <w:r>
-        <w:rPr>
-          <w:rFonts w:ascii="Calibri" w:cs="Calibri" w:eastAsia="Calibri" w:hAnsi="Calibri"/>
-          <w:b/>
-          <w:bCs/>
-          <w:color w:val="0B6E72"/>
-          <w:sz w:val="30"/>
-          <w:szCs w:val="30"/>
-        </w:rPr>
-        <w:t xml:space="preserve">Slide 15 — No ar, de graça e de forma automática</w:t>
-      </w:r>
-    </w:p>
-    <w:p>
-      <w:pPr>
-        <w:spacing w:after="120" w:line="360"/>
-      </w:pPr>
-      <w:r>
-        <w:rPr>
-          <w:rFonts w:ascii="Calibri" w:cs="Calibri" w:eastAsia="Calibri" w:hAnsi="Calibri"/>
-          <w:sz w:val="24"/>
-          <w:szCs w:val="24"/>
-        </w:rPr>
-        <w:t xml:space="preserve">Para publicar eu uso o GitHub Pages, que é gratuito. Funciona assim: eu envio o código para o GitHub, ele roda os 28 testes e, se tudo passar, publica o site com https, que é necessário para o GPS e para instalar o app. Se algum teste falhar, a versão antiga continua no ar. O endereço está na tela e o código é aberto. Quem quiser pode abrir no celular agora.</w:t>
-      </w:r>
-    </w:p>
-    <w:p>
-      <w:pPr>
-        <w:pStyle w:val="Heading1"/>
-        <w:keepNext/>
-        <w:spacing w:after="120" w:before="320"/>
-      </w:pPr>
-      <w:r>
-        <w:rPr>
-          <w:rFonts w:ascii="Calibri" w:cs="Calibri" w:eastAsia="Calibri" w:hAnsi="Calibri"/>
-          <w:b/>
-          <w:bCs/>
-          <w:color w:val="0B6E72"/>
-          <w:sz w:val="30"/>
-          <w:szCs w:val="30"/>
-        </w:rPr>
-        <w:t xml:space="preserve">Slide 16 — O que ainda falta, e eu sei disso</w:t>
-      </w:r>
-    </w:p>
-    <w:p>
-      <w:pPr>
-        <w:spacing w:after="120" w:line="360"/>
-      </w:pPr>
-      <w:r>
-        <w:rPr>
-          <w:rFonts w:ascii="Calibri" w:cs="Calibri" w:eastAsia="Calibri" w:hAnsi="Calibri"/>
-          <w:sz w:val="24"/>
-          <w:szCs w:val="24"/>
-        </w:rPr>
-        <w:t xml:space="preserve">Quero ser sincero sobre os limites. Os horários são estimados, e o app avisa para confirmar no local. Os avisos da comunidade ficam só no aparelho de quem criou, porque eu não tenho servidor; esse é o primeiro próximo passo. Os serviços gratuitos às vezes demoram. Dezoito lugares ficaram sem foto, porque não achei imagem livre adequada. E eu ainda quero testar em mais celulares. Nos próximos passos, quero ter o servidor, versões em inglês e espanhol e medir a qualidade da busca.</w:t>
-      </w:r>
-    </w:p>
-    <w:p>
-      <w:pPr>
-        <w:pStyle w:val="Heading1"/>
-        <w:keepNext/>
-        <w:spacing w:after="120" w:before="320"/>
-      </w:pPr>
-      <w:r>
-        <w:rPr>
-          <w:rFonts w:ascii="Calibri" w:cs="Calibri" w:eastAsia="Calibri" w:hAnsi="Calibri"/>
-          <w:b/>
-          <w:bCs/>
-          <w:color w:val="0B6E72"/>
-          <w:sz w:val="30"/>
-          <w:szCs w:val="30"/>
-        </w:rPr>
-        <w:t xml:space="preserve">Slide 17 — Como foi feito</w:t>
-      </w:r>
-    </w:p>
-    <w:p>
-      <w:pPr>
-        <w:spacing w:after="120" w:line="360"/>
-      </w:pPr>
-      <w:r>
-        <w:rPr>
-          <w:rFonts w:ascii="Calibri" w:cs="Calibri" w:eastAsia="Calibri" w:hAnsi="Calibri"/>
-          <w:sz w:val="24"/>
-          <w:szCs w:val="24"/>
-        </w:rPr>
-        <w:t xml:space="preserve">Resumindo como o projeto foi montado. O mapa usa o Leaflet com os dados do OpenStreetMap, e as rotas vêm da API do OSRM. A busca é um código próprio, com pontuação por campo, sinônimos e tolerância a erro de digitação. Chuva, UV, vento e ondas vêm da API do Open-Meteo. Os 65 lugares foram conferidos com o OpenStreetMap e a Wikipédia, e as fotos são do Wikimedia Commons, só com licença livre. Para publicar, o GitHub roda os testes e coloca o site no ar. Aprendi bastante sobre como uma busca funciona por dentro e como um app roda sem servidor.</w:t>
-      </w:r>
-    </w:p>
-    <w:p>
-      <w:pPr>
-        <w:pStyle w:val="Heading1"/>
-        <w:keepNext/>
-        <w:spacing w:after="120" w:before="320"/>
-      </w:pPr>
-      <w:r>
-        <w:rPr>
-          <w:rFonts w:ascii="Calibri" w:cs="Calibri" w:eastAsia="Calibri" w:hAnsi="Calibri"/>
-          <w:b/>
-          <w:bCs/>
-          <w:color w:val="0B6E72"/>
-          <w:sz w:val="30"/>
-          <w:szCs w:val="30"/>
-        </w:rPr>
-        <w:t xml:space="preserve">Slide 18 — Obrigado!</w:t>
-      </w:r>
-    </w:p>
-    <w:p>
-      <w:pPr>
-        <w:spacing w:after="120" w:line="360"/>
-      </w:pPr>
-      <w:r>
-        <w:rPr>
-          <w:rFonts w:ascii="Calibri" w:cs="Calibri" w:eastAsia="Calibri" w:hAnsi="Calibri"/>
-          <w:sz w:val="24"/>
-          <w:szCs w:val="24"/>
-        </w:rPr>
-        <w:t xml:space="preserve">Obrigado por ouvirem. O endereço do app está na tela, e quem quiser pode abrir no celular e testar agora. Fico à disposição para perguntas sobre a busca, os dados, o visual ou qualquer parte do código.</w:t>
+        <w:t xml:space="preserve">Slide 3 — A ideia: um Waze de lugares</w:t>
+      </w:r>
+    </w:p>
+    <w:p>
+      <w:pPr>
+        <w:spacing w:after="120" w:line="360"/>
+      </w:pPr>
+      <w:r>
+        <w:rPr>
+          <w:rFonts w:ascii="Calibri" w:cs="Calibri" w:eastAsia="Calibri" w:hAnsi="Calibri"/>
+          <w:sz w:val="24"/>
+          <w:szCs w:val="24"/>
+        </w:rPr>
+        <w:t xml:space="preserve">A proposta era fazer um aplicativo de busca, tipo um Waze de lugares interessantes de Fortaleza. Eu dividi em quatro partes: buscar, que é achar o lugar mesmo digitando errado; chegar, com mapa e rotas; decidir, com sugestões pela hora, sol e chuva; e a comunidade, com avisos que somem sozinhos, como no Waze. Eu olhei como outros apps resolvem problemas parecidos, como o Citymapper para rotas e o Swarm para o passaporte, e peguei as ideias.</w:t>
+      </w:r>
+    </w:p>
+    <w:p>
+      <w:pPr>
+        <w:pStyle w:val="Heading1"/>
+        <w:keepNext/>
+        <w:spacing w:after="120" w:before="320"/>
+      </w:pPr>
+      <w:r>
+        <w:rPr>
+          <w:rFonts w:ascii="Calibri" w:cs="Calibri" w:eastAsia="Calibri" w:hAnsi="Calibri"/>
+          <w:b/>
+          <w:bCs/>
+          <w:color w:val="0B6E72"/>
+          <w:sz w:val="30"/>
+          <w:szCs w:val="30"/>
+        </w:rPr>
+        <w:t xml:space="preserve">Slide 4 — O app</w:t>
+      </w:r>
+    </w:p>
+    <w:p>
+      <w:pPr>
+        <w:spacing w:after="120" w:line="360"/>
+      </w:pPr>
+      <w:r>
+        <w:rPr>
+          <w:rFonts w:ascii="Calibri" w:cs="Calibri" w:eastAsia="Calibri" w:hAnsi="Calibri"/>
+          <w:sz w:val="24"/>
+          <w:szCs w:val="24"/>
+        </w:rPr>
+        <w:t xml:space="preserve">Este é o resultado. À esquerda, o mapa com um pin para cada lugar. À direita, a lista, que eu desenhei parecida com um guia de revista: foto, categoria, nome e informações principais. São 65 lugares de Fortaleza e arredores. No topo, em laranja, fica a sugestão do momento: na hora do almoço ele sugere lugares para comer, perto do pôr do sol sugere mirantes, e se estiver chovendo mostra só lugares cobertos.</w:t>
+      </w:r>
+    </w:p>
+    <w:p>
+      <w:pPr>
+        <w:pStyle w:val="Heading1"/>
+        <w:keepNext/>
+        <w:spacing w:after="120" w:before="320"/>
+      </w:pPr>
+      <w:r>
+        <w:rPr>
+          <w:rFonts w:ascii="Calibri" w:cs="Calibri" w:eastAsia="Calibri" w:hAnsi="Calibri"/>
+          <w:b/>
+          <w:bCs/>
+          <w:color w:val="0B6E72"/>
+          <w:sz w:val="30"/>
+          <w:szCs w:val="30"/>
+        </w:rPr>
+        <w:t xml:space="preserve">Slide 5 — Busca que entende o que você quer</w:t>
+      </w:r>
+    </w:p>
+    <w:p>
+      <w:pPr>
+        <w:spacing w:after="120" w:line="360"/>
+      </w:pPr>
+      <w:r>
+        <w:rPr>
+          <w:rFonts w:ascii="Calibri" w:cs="Calibri" w:eastAsia="Calibri" w:hAnsi="Calibri"/>
+          <w:sz w:val="24"/>
+          <w:szCs w:val="24"/>
+        </w:rPr>
+        <w:t xml:space="preserve">Esta é a parte mais ligada à matéria de Busca. O app aceita erro de digitação: se a pessoa escreve “mercdo”, ele acha “mercado”. Ele também entende palavras parecidas: quem digita “comer” encontra restaurantes. E tem o caso que eu mais gosto: “churrascaria” não está na minha lista. Em vez de mostrar “nada encontrado”, o app procura em toda Fortaleza e achou 46 lugares. Os detalhes de como isso funciona por dentro estão no apêndice.</w:t>
+      </w:r>
+    </w:p>
+    <w:p>
+      <w:pPr>
+        <w:pStyle w:val="Heading1"/>
+        <w:keepNext/>
+        <w:spacing w:after="120" w:before="320"/>
+      </w:pPr>
+      <w:r>
+        <w:rPr>
+          <w:rFonts w:ascii="Calibri" w:cs="Calibri" w:eastAsia="Calibri" w:hAnsi="Calibri"/>
+          <w:b/>
+          <w:bCs/>
+          <w:color w:val="0B6E72"/>
+          <w:sz w:val="30"/>
+          <w:szCs w:val="30"/>
+        </w:rPr>
+        <w:t xml:space="preserve">Slide 6 — O app muda com a hora e o clima</w:t>
+      </w:r>
+    </w:p>
+    <w:p>
+      <w:pPr>
+        <w:spacing w:after="120" w:line="360"/>
+      </w:pPr>
+      <w:r>
+        <w:rPr>
+          <w:rFonts w:ascii="Calibri" w:cs="Calibri" w:eastAsia="Calibri" w:hAnsi="Calibri"/>
+          <w:sz w:val="24"/>
+          <w:szCs w:val="24"/>
+        </w:rPr>
+        <w:t xml:space="preserve">Este é o diferencial. O app olha a hora e o clima. Se estiver chovendo, só aparecem lugares cobertos, como museus e cinemas. Nas praias o app mostra ondas, UV e vento, com um conselho simples, como “UV alto: passe protetor”. Tudo usa o horário de Fortaleza, então até um turista com o celular em outro fuso vê “aberto” ou “fechado” certo. Os dados do mar são uma estimativa, não vêm de um sensor na praia.</w:t>
+      </w:r>
+    </w:p>
+    <w:p>
+      <w:pPr>
+        <w:pStyle w:val="Heading1"/>
+        <w:keepNext/>
+        <w:spacing w:after="120" w:before="320"/>
+      </w:pPr>
+      <w:r>
+        <w:rPr>
+          <w:rFonts w:ascii="Calibri" w:cs="Calibri" w:eastAsia="Calibri" w:hAnsi="Calibri"/>
+          <w:b/>
+          <w:bCs/>
+          <w:color w:val="0B6E72"/>
+          <w:sz w:val="30"/>
+          <w:szCs w:val="30"/>
+        </w:rPr>
+        <w:t xml:space="preserve">Slide 7 — Como chegar e o que visitar</w:t>
+      </w:r>
+    </w:p>
+    <w:p>
+      <w:pPr>
+        <w:spacing w:after="120" w:line="360"/>
+      </w:pPr>
+      <w:r>
+        <w:rPr>
+          <w:rFonts w:ascii="Calibri" w:cs="Calibri" w:eastAsia="Calibri" w:hAnsi="Calibri"/>
+          <w:sz w:val="24"/>
+          <w:szCs w:val="24"/>
+        </w:rPr>
+        <w:t xml:space="preserve">Aqui são duas funções. À esquerda, a rota: o app mostra carro, bike e a pé ao mesmo tempo, com o tempo de cada um, por exemplo 5, 13 e 30 minutos. Para o pôr do sol, ele diz a que horas você precisa sair. À direita, o roteiro: quando a pessoa escolhe vários lugares, o app organiza a ordem da visita para andar menos.</w:t>
+      </w:r>
+    </w:p>
+    <w:p>
+      <w:pPr>
+        <w:pStyle w:val="Heading1"/>
+        <w:keepNext/>
+        <w:spacing w:after="120" w:before="320"/>
+      </w:pPr>
+      <w:r>
+        <w:rPr>
+          <w:rFonts w:ascii="Calibri" w:cs="Calibri" w:eastAsia="Calibri" w:hAnsi="Calibri"/>
+          <w:b/>
+          <w:bCs/>
+          <w:color w:val="0B6E72"/>
+          <w:sz w:val="30"/>
+          <w:szCs w:val="30"/>
+        </w:rPr>
+        <w:t xml:space="preserve">Slide 8 — Passaporte e cartão para Stories</w:t>
+      </w:r>
+    </w:p>
+    <w:p>
+      <w:pPr>
+        <w:spacing w:after="120" w:line="360"/>
+      </w:pPr>
+      <w:r>
+        <w:rPr>
+          <w:rFonts w:ascii="Calibri" w:cs="Calibri" w:eastAsia="Calibri" w:hAnsi="Calibri"/>
+          <w:sz w:val="24"/>
+          <w:szCs w:val="24"/>
+        </w:rPr>
+        <w:t xml:space="preserve">Um app precisa de um motivo para a pessoa voltar. Do Swarm eu peguei a ideia do passaporte: em cada lugar a pessoa toca em “Já fui aqui” e ganha um carimbo com a data, e há selos por categoria, como o “Praieiro” para quem visita três praias. Isso fica só no aparelho dela. Já o cartão para Stories é uma imagem que o app desenha com o roteiro montado, para a pessoa postar e divulgar o app.</w:t>
+      </w:r>
+    </w:p>
+    <w:p>
+      <w:pPr>
+        <w:pStyle w:val="Heading1"/>
+        <w:keepNext/>
+        <w:spacing w:after="120" w:before="320"/>
+      </w:pPr>
+      <w:r>
+        <w:rPr>
+          <w:rFonts w:ascii="Calibri" w:cs="Calibri" w:eastAsia="Calibri" w:hAnsi="Calibri"/>
+          <w:b/>
+          <w:bCs/>
+          <w:color w:val="0B6E72"/>
+          <w:sz w:val="30"/>
+          <w:szCs w:val="30"/>
+        </w:rPr>
+        <w:t xml:space="preserve">Slide 9 — Funciona no celular</w:t>
+      </w:r>
+    </w:p>
+    <w:p>
+      <w:pPr>
+        <w:spacing w:after="120" w:line="360"/>
+      </w:pPr>
+      <w:r>
+        <w:rPr>
+          <w:rFonts w:ascii="Calibri" w:cs="Calibri" w:eastAsia="Calibri" w:hAnsi="Calibri"/>
+          <w:sz w:val="24"/>
+          <w:szCs w:val="24"/>
+        </w:rPr>
+        <w:t xml:space="preserve">Como a maioria vai usar no celular, eu pensei nele primeiro. Dá para instalar na tela inicial, como um app de verdade, e abrir mesmo sem internet. A lista é uma gaveta que acompanha o dedo: empurra para ver o mapa, puxa para ver a lista. Tem busca por voz e um guia que fala quando você chega perto de um lugar do roteiro. A localização e o microfone só são pedidos quando a pessoa toca nos botões.</w:t>
+      </w:r>
+    </w:p>
+    <w:p>
+      <w:pPr>
+        <w:pStyle w:val="Heading1"/>
+        <w:keepNext/>
+        <w:spacing w:after="120" w:before="320"/>
+      </w:pPr>
+      <w:r>
+        <w:rPr>
+          <w:rFonts w:ascii="Calibri" w:cs="Calibri" w:eastAsia="Calibri" w:hAnsi="Calibri"/>
+          <w:b/>
+          <w:bCs/>
+          <w:color w:val="0B6E72"/>
+          <w:sz w:val="30"/>
+          <w:szCs w:val="30"/>
+        </w:rPr>
+        <w:t xml:space="preserve">Slide 10 — O que eu usei e para quê</w:t>
+      </w:r>
+    </w:p>
+    <w:p>
+      <w:pPr>
+        <w:spacing w:after="120" w:line="360"/>
+      </w:pPr>
+      <w:r>
+        <w:rPr>
+          <w:rFonts w:ascii="Calibri" w:cs="Calibri" w:eastAsia="Calibri" w:hAnsi="Calibri"/>
+          <w:sz w:val="24"/>
+          <w:szCs w:val="24"/>
+        </w:rPr>
+        <w:t xml:space="preserve">Aqui é uma visão geral do que eu usei, sem entrar em detalhe de código. Páginas web comuns, para o app abrir em qualquer navegador e celular. Mapas abertos, para ter mapa e rotas sem custo. Dados abertos de clima, para chuva, UV, vento e mar. Fotos de licença livre, com o crédito do autor. Testes automáticos, para não quebrar o que já funciona. E uma hospedagem gratuita, então o site fica no ar sem eu precisar de servidor. Nada disso pede cadastro ou chave, então qualquer pessoa consegue reproduzir.</w:t>
+      </w:r>
+    </w:p>
+    <w:p>
+      <w:pPr>
+        <w:pStyle w:val="Heading1"/>
+        <w:keepNext/>
+        <w:spacing w:after="120" w:before="320"/>
+      </w:pPr>
+      <w:r>
+        <w:rPr>
+          <w:rFonts w:ascii="Calibri" w:cs="Calibri" w:eastAsia="Calibri" w:hAnsi="Calibri"/>
+          <w:b/>
+          <w:bCs/>
+          <w:color w:val="0B6E72"/>
+          <w:sz w:val="30"/>
+          <w:szCs w:val="30"/>
+        </w:rPr>
+        <w:t xml:space="preserve">Slide 11 — Dados confiáveis</w:t>
+      </w:r>
+    </w:p>
+    <w:p>
+      <w:pPr>
+        <w:spacing w:after="120" w:line="360"/>
+      </w:pPr>
+      <w:r>
+        <w:rPr>
+          <w:rFonts w:ascii="Calibri" w:cs="Calibri" w:eastAsia="Calibri" w:hAnsi="Calibri"/>
+          <w:sz w:val="24"/>
+          <w:szCs w:val="24"/>
+        </w:rPr>
+        <w:t xml:space="preserve">Num app de turismo, um pin no lugar errado é o erro mais visível. Por isso eu conferi cada posição no OpenStreetMap e, quando tinha, também na Wikipédia. Meus números iniciais erravam até 1,6 km, como no Farol do Mucuripe, e eu corrigi todos. As 47 fotos têm licença livre e mostram o autor. O que eu não consegui confirmar, tirei do app. Os horários de funcionamento ainda são estimados, e o app avisa isso.</w:t>
+      </w:r>
+    </w:p>
+    <w:p>
+      <w:pPr>
+        <w:pStyle w:val="Heading1"/>
+        <w:keepNext/>
+        <w:spacing w:after="120" w:before="320"/>
+      </w:pPr>
+      <w:r>
+        <w:rPr>
+          <w:rFonts w:ascii="Calibri" w:cs="Calibri" w:eastAsia="Calibri" w:hAnsi="Calibri"/>
+          <w:b/>
+          <w:bCs/>
+          <w:color w:val="0B6E72"/>
+          <w:sz w:val="30"/>
+          <w:szCs w:val="30"/>
+        </w:rPr>
+        <w:t xml:space="preserve">Slide 12 — Limites e possíveis atualizações</w:t>
+      </w:r>
+    </w:p>
+    <w:p>
+      <w:pPr>
+        <w:spacing w:after="120" w:line="360"/>
+      </w:pPr>
+      <w:r>
+        <w:rPr>
+          <w:rFonts w:ascii="Calibri" w:cs="Calibri" w:eastAsia="Calibri" w:hAnsi="Calibri"/>
+          <w:sz w:val="24"/>
+          <w:szCs w:val="24"/>
+        </w:rPr>
+        <w:t xml:space="preserve">Quero ser sincero sobre os limites. Hoje os horários são estimados, os avisos da comunidade ficam só no aparelho de quem criou, e 18 lugares estão sem foto. O primeiro próximo passo é um servidor, para os avisos valerem entre pessoas. Depois, versões em inglês e espanhol, horários e preços reais e mais lugares. E também quero testar em mais celulares e medir a qualidade da busca.</w:t>
+      </w:r>
+    </w:p>
+    <w:p>
+      <w:pPr>
+        <w:pStyle w:val="Heading1"/>
+        <w:keepNext/>
+        <w:spacing w:after="120" w:before="320"/>
+      </w:pPr>
+      <w:r>
+        <w:rPr>
+          <w:rFonts w:ascii="Calibri" w:cs="Calibri" w:eastAsia="Calibri" w:hAnsi="Calibri"/>
+          <w:b/>
+          <w:bCs/>
+          <w:color w:val="0B6E72"/>
+          <w:sz w:val="30"/>
+          <w:szCs w:val="30"/>
+        </w:rPr>
+        <w:t xml:space="preserve">Slide 13 — Obrigado!</w:t>
+      </w:r>
+    </w:p>
+    <w:p>
+      <w:pPr>
+        <w:spacing w:after="120" w:line="360"/>
+      </w:pPr>
+      <w:r>
+        <w:rPr>
+          <w:rFonts w:ascii="Calibri" w:cs="Calibri" w:eastAsia="Calibri" w:hAnsi="Calibri"/>
+          <w:sz w:val="24"/>
+          <w:szCs w:val="24"/>
+        </w:rPr>
+        <w:t xml:space="preserve">Obrigado por ouvirem. O endereço do app está na tela, e quem quiser pode abrir no celular e testar agora. Fico à disposição para perguntas.</w:t>
+      </w:r>
+    </w:p>
+    <w:p>
+      <w:pPr>
+        <w:pageBreakBefore/>
+        <w:spacing w:after="120"/>
+      </w:pPr>
+      <w:r>
+        <w:rPr>
+          <w:rFonts w:ascii="Calibri" w:cs="Calibri" w:eastAsia="Calibri" w:hAnsi="Calibri"/>
+          <w:b/>
+          <w:bCs/>
+          <w:color w:val="D4601C"/>
+          <w:sz w:val="32"/>
+          <w:szCs w:val="32"/>
+        </w:rPr>
+        <w:t xml:space="preserve">APÊNDICE TÉCNICO (para os colegas)</w:t>
+      </w:r>
+    </w:p>
+    <w:p>
+      <w:pPr>
+        <w:pStyle w:val="Heading1"/>
+        <w:keepNext/>
+        <w:spacing w:after="120" w:before="320"/>
+      </w:pPr>
+      <w:r>
+        <w:rPr>
+          <w:rFonts w:ascii="Calibri" w:cs="Calibri" w:eastAsia="Calibri" w:hAnsi="Calibri"/>
+          <w:b/>
+          <w:bCs/>
+          <w:color w:val="0B6E72"/>
+          <w:sz w:val="30"/>
+          <w:szCs w:val="30"/>
+        </w:rPr>
+        <w:t xml:space="preserve">Slide 14 — Extra: detalhes técnicos</w:t>
+      </w:r>
+    </w:p>
+    <w:p>
+      <w:pPr>
+        <w:spacing w:after="120" w:line="360"/>
+      </w:pPr>
+      <w:r>
+        <w:rPr>
+          <w:rFonts w:ascii="Calibri" w:cs="Calibri" w:eastAsia="Calibri" w:hAnsi="Calibri"/>
+          <w:sz w:val="24"/>
+          <w:szCs w:val="24"/>
+        </w:rPr>
+        <w:t xml:space="preserve">Este é o apêndice, para quem quiser ver por dentro. Os próximos slides explicam a parte técnica com mais detalhe.</w:t>
+      </w:r>
+    </w:p>
+    <w:p>
+      <w:pPr>
+        <w:pStyle w:val="Heading1"/>
+        <w:keepNext/>
+        <w:spacing w:after="120" w:before="320"/>
+      </w:pPr>
+      <w:r>
+        <w:rPr>
+          <w:rFonts w:ascii="Calibri" w:cs="Calibri" w:eastAsia="Calibri" w:hAnsi="Calibri"/>
+          <w:b/>
+          <w:bCs/>
+          <w:color w:val="0B6E72"/>
+          <w:sz w:val="30"/>
+          <w:szCs w:val="30"/>
+        </w:rPr>
+        <w:t xml:space="preserve">Slide 15 — Três camadas, sem framework</w:t>
+      </w:r>
+    </w:p>
+    <w:p>
+      <w:pPr>
+        <w:spacing w:after="120" w:line="360"/>
+      </w:pPr>
+      <w:r>
+        <w:rPr>
+          <w:rFonts w:ascii="Calibri" w:cs="Calibri" w:eastAsia="Calibri" w:hAnsi="Calibri"/>
+          <w:sz w:val="24"/>
+          <w:szCs w:val="24"/>
+        </w:rPr>
+        <w:t xml:space="preserve">Eu escolhi não usar framework, só HTML, CSS e JavaScript. O app tem três camadas: a interface, que é o que se vê, com o Leaflet para o mapa; a lógica, que são arquivos separados que eu consigo testar sozinhos; e os dados, com 65 lugares e cinco serviços abertos. Como tudo roda no navegador, não precisei de servidor.</w:t>
+      </w:r>
+    </w:p>
+    <w:p>
+      <w:pPr>
+        <w:pStyle w:val="Heading1"/>
+        <w:keepNext/>
+        <w:spacing w:after="120" w:before="320"/>
+      </w:pPr>
+      <w:r>
+        <w:rPr>
+          <w:rFonts w:ascii="Calibri" w:cs="Calibri" w:eastAsia="Calibri" w:hAnsi="Calibri"/>
+          <w:b/>
+          <w:bCs/>
+          <w:color w:val="0B6E72"/>
+          <w:sz w:val="30"/>
+          <w:szCs w:val="30"/>
+        </w:rPr>
+        <w:t xml:space="preserve">Slide 16 — De onde vem cada informação</w:t>
+      </w:r>
+    </w:p>
+    <w:p>
+      <w:pPr>
+        <w:spacing w:after="120" w:line="360"/>
+      </w:pPr>
+      <w:r>
+        <w:rPr>
+          <w:rFonts w:ascii="Calibri" w:cs="Calibri" w:eastAsia="Calibri" w:hAnsi="Calibri"/>
+          <w:sz w:val="24"/>
+          <w:szCs w:val="24"/>
+        </w:rPr>
+        <w:t xml:space="preserve">O mapa e as ruas vêm do OpenStreetMap. As rotas vêm do OSRM. Para achar lugares que não estão na minha base, uso o Overpass e o Nominatim, também do OpenStreetMap. Clima, UV, vento e mar vêm do Open-Meteo. As fotos vêm do Wikimedia Commons, só com licença livre. E tem a minha base com 65 lugares.</w:t>
+      </w:r>
+    </w:p>
+    <w:p>
+      <w:pPr>
+        <w:pStyle w:val="Heading1"/>
+        <w:keepNext/>
+        <w:spacing w:after="120" w:before="320"/>
+      </w:pPr>
+      <w:r>
+        <w:rPr>
+          <w:rFonts w:ascii="Calibri" w:cs="Calibri" w:eastAsia="Calibri" w:hAnsi="Calibri"/>
+          <w:b/>
+          <w:bCs/>
+          <w:color w:val="0B6E72"/>
+          <w:sz w:val="30"/>
+          <w:szCs w:val="30"/>
+        </w:rPr>
+        <w:t xml:space="preserve">Slide 17 — A busca por dentro</w:t>
+      </w:r>
+    </w:p>
+    <w:p>
+      <w:pPr>
+        <w:spacing w:after="120" w:line="360"/>
+      </w:pPr>
+      <w:r>
+        <w:rPr>
+          <w:rFonts w:ascii="Calibri" w:cs="Calibri" w:eastAsia="Calibri" w:hAnsi="Calibri"/>
+          <w:sz w:val="24"/>
+          <w:szCs w:val="24"/>
+        </w:rPr>
+        <w:t xml:space="preserve">Quando alguém digita, o app faz quatro coisas. Primeiro, ignora acento e maiúscula. Segundo, dá mais pontos se a palavra está no nome do que se está só na descrição. Terceiro, entende sinônimos. Quarto, aceita erro de digitação usando a distância de Levenshtein, que conta quantas letras são diferentes: “mercdo” está a uma letra de “mercado”. Se não acha na base, procura em toda Fortaleza e guarda o resultado por 24 horas.</w:t>
+      </w:r>
+    </w:p>
+    <w:p>
+      <w:pPr>
+        <w:pStyle w:val="Heading1"/>
+        <w:keepNext/>
+        <w:spacing w:after="120" w:before="320"/>
+      </w:pPr>
+      <w:r>
+        <w:rPr>
+          <w:rFonts w:ascii="Calibri" w:cs="Calibri" w:eastAsia="Calibri" w:hAnsi="Calibri"/>
+          <w:b/>
+          <w:bCs/>
+          <w:color w:val="0B6E72"/>
+          <w:sz w:val="30"/>
+          <w:szCs w:val="30"/>
+        </w:rPr>
+        <w:t xml:space="preserve">Slide 18 — Ordem do roteiro: vizinho mais próximo</w:t>
+      </w:r>
+    </w:p>
+    <w:p>
+      <w:pPr>
+        <w:spacing w:after="120" w:line="360"/>
+      </w:pPr>
+      <w:r>
+        <w:rPr>
+          <w:rFonts w:ascii="Calibri" w:cs="Calibri" w:eastAsia="Calibri" w:hAnsi="Calibri"/>
+          <w:sz w:val="24"/>
+          <w:szCs w:val="24"/>
+        </w:rPr>
+        <w:t xml:space="preserve">Escolher a melhor ordem de visita é o problema do caixeiro viajante, que é difícil de resolver de forma exata. Eu usei uma heurística: começo pelo lugar mais próximo e depois desfaço os cruzamentos do caminho, com uma técnica chamada 2-opt. Não garante o melhor caminho possível, mas para poucas paradas é rápido e bom.</w:t>
+      </w:r>
+    </w:p>
+    <w:p>
+      <w:pPr>
+        <w:pStyle w:val="Heading1"/>
+        <w:keepNext/>
+        <w:spacing w:after="120" w:before="320"/>
+      </w:pPr>
+      <w:r>
+        <w:rPr>
+          <w:rFonts w:ascii="Calibri" w:cs="Calibri" w:eastAsia="Calibri" w:hAnsi="Calibri"/>
+          <w:b/>
+          <w:bCs/>
+          <w:color w:val="0B6E72"/>
+          <w:sz w:val="30"/>
+          <w:szCs w:val="30"/>
+        </w:rPr>
+        <w:t xml:space="preserve">Slide 19 — Funciona offline: PWA</w:t>
+      </w:r>
+    </w:p>
+    <w:p>
+      <w:pPr>
+        <w:spacing w:after="120" w:line="360"/>
+      </w:pPr>
+      <w:r>
+        <w:rPr>
+          <w:rFonts w:ascii="Calibri" w:cs="Calibri" w:eastAsia="Calibri" w:hAnsi="Calibri"/>
+          <w:sz w:val="24"/>
+          <w:szCs w:val="24"/>
+        </w:rPr>
+        <w:t xml:space="preserve">O app é um PWA, um aplicativo web progressivo. Um service worker guarda o app, a base e as fontes no aparelho, então ele abre sem internet. Eu simulei o comportamento do celular no computador, e ainda falta testar em aparelhos reais. Para publicar, uso o GitHub Pages: eu envio o código, o GitHub roda os 28 testes e, se passar, coloca o site no ar. Se um teste falhar, a versão antiga continua.</w:t>
       </w:r>
     </w:p>
     <w:sectPr>

</xml_diff>